<commit_message>
Restore profiler write-lock lost in restructure; update setup guide for new CLI
The adopt-data297-layout refactor kept the profiler 503-degrade but dropped
the concurrency write-lock, so --workers > 1 again corrupts the shared
codebase_sheet.filled.xlsx (BadZipFile) as parallel phases append to it.
Re-add threading.Lock around append_row in run_profiler.

Rewrite Org_Analyser_Setup_Guide.docx for the new package layout: install
via 'pip install -e .', tokens in config.yml (tokens: block) instead of a
flat tokens file, all run commands switched from 'python run_org_pipeline.py
--tokens-file tokens' to 'org-analyser', quality skip via --skip-quality-score,
and drop the obsolete ORG_PIPELINE_PYTHON/tokens.example steps. Remove a stray
docx backup.
</commit_message>
<xml_diff>
--- a/Org_Analyser_Setup_Guide.docx
+++ b/Org_Analyser_Setup_Guide.docx
@@ -540,17 +540,17 @@
           <w:sz-cs w:val="20"/>
           <w:color w:val="111111"/>
         </w:rPr>
-        <w:t xml:space="preserve">python3.12 -m venv .venv</w:t>
+        <w:t>python3.12 -m venv .venv</w:t>
         <w:br/>
-        <w:t xml:space="preserve">source .venv/bin/activate</w:t>
+        <w:t>source .venv/bin/activate</w:t>
         <w:br/>
-        <w:t xml:space="preserve">python --version</w:t>
+        <w:t>python --version</w:t>
         <w:br/>
-        <w:t xml:space="preserve">python -m pip install --upgrade pip setuptools wheel hatchling</w:t>
+        <w:t>python -m pip install --upgrade pip</w:t>
         <w:br/>
-        <w:t xml:space="preserve">python -m pip install -r requirements.txt</w:t>
+        <w:t>pip install -e .</w:t>
         <w:br/>
-        <w:t xml:space="preserve">python -m pip install -e ./codebase_profiler</w:t>
+        <w:t>cp config.example.yml config.yml</w:t>
       </w:r>
     </w:p>
     <w:p>
@@ -606,29 +606,6 @@
       <w:r>
         <w:rPr>
           <w:rFonts w:ascii="Times" w:hAnsi="Times" w:cs="Times"/>
-          <w:sz w:val="24"/>
-          <w:sz-cs w:val="24"/>
-        </w:rPr>
-        <w:t xml:space="preserve">Finally, run this one line so the tool knows which Python to use internally:</w:t>
-      </w:r>
-    </w:p>
-    <w:p>
-      <w:pPr/>
-      <w:r>
-        <w:rPr>
-          <w:rFonts w:ascii="Times" w:hAnsi="Times" w:cs="Times"/>
-          <w:sz w:val="20"/>
-          <w:sz-cs w:val="20"/>
-          <w:color w:val="111111"/>
-        </w:rPr>
-        <w:t xml:space="preserve">export ORG_PIPELINE_PYTHON="$(pwd)/.venv/bin/python"</w:t>
-      </w:r>
-    </w:p>
-    <w:p>
-      <w:pPr/>
-      <w:r>
-        <w:rPr>
-          <w:rFonts w:ascii="Times" w:hAnsi="Times" w:cs="Times"/>
           <w:sz w:val="20"/>
           <w:sz-cs w:val="20"/>
           <w:color w:val="111111"/>
@@ -648,7 +625,7 @@
           <w:b/>
           <w:color w:val="2A5C8A"/>
         </w:rPr>
-        <w:t xml:space="preserve">IMPORTANT: </w:t>
+        <w:t>IMPORTANT: If you close Terminal and reopen it later, you must redo the “source .venv/bin/activate” line before running the tool again (on Windows: .venv\Scripts\activate). The install steps in Step 3 only need to be done once.</w:t>
       </w:r>
       <w:r>
         <w:rPr>
@@ -658,7 +635,6 @@
           <w:i/>
           <w:color w:val="555555"/>
         </w:rPr>
-        <w:t xml:space="preserve">If you close Terminal and reopen it later, you will need to redo the “source .venv/bin/activate” and “export ORG_PIPELINE_PYTHON...” lines again before running the pipeline. The other install steps only need to happen once.</w:t>
       </w:r>
     </w:p>
     <w:p>
@@ -692,62 +668,52 @@
           <w:sz w:val="24"/>
           <w:sz-cs w:val="24"/>
         </w:rPr>
-        <w:t xml:space="preserve">First, make your own copy of the example token file:</w:t>
-      </w:r>
-    </w:p>
-    <w:p>
-      <w:pPr/>
-      <w:r>
-        <w:rPr>
-          <w:rFonts w:ascii="Times" w:hAnsi="Times" w:cs="Times"/>
-          <w:sz w:val="20"/>
-          <w:sz-cs w:val="20"/>
-          <w:color w:val="111111"/>
-        </w:rPr>
-        <w:t xml:space="preserve">cp tokens.example tokens</w:t>
-      </w:r>
-    </w:p>
-    <w:p>
-      <w:pPr/>
-      <w:r>
-        <w:rPr>
-          <w:rFonts w:ascii="Times" w:hAnsi="Times" w:cs="Times"/>
-          <w:sz w:val="20"/>
-          <w:sz-cs w:val="20"/>
-          <w:color w:val="111111"/>
-        </w:rPr>
-        <w:t xml:space="preserve"/>
-      </w:r>
-    </w:p>
-    <w:p>
-      <w:pPr/>
-      <w:r>
-        <w:rPr>
-          <w:rFonts w:ascii="Times" w:hAnsi="Times" w:cs="Times"/>
-          <w:sz w:val="24"/>
-          <w:sz-cs w:val="24"/>
-        </w:rPr>
-        <w:t xml:space="preserve">Then open the new “tokens” file in a text editor (TextEdit, VS Code, Notepad, etc.) and fill it in like this:</w:t>
-      </w:r>
-    </w:p>
-    <w:p>
-      <w:pPr/>
-      <w:r>
-        <w:rPr>
-          <w:rFonts w:ascii="Times" w:hAnsi="Times" w:cs="Times"/>
-          <w:sz w:val="20"/>
-          <w:sz-cs w:val="20"/>
-          <w:color w:val="111111"/>
-        </w:rPr>
-        <w:t xml:space="preserve">github-data-token=ghp_your_github_token</w:t>
+        <w:t>You already created your settings file, config.yml, back in Step 3. Open it in a text editor (TextEdit, VS Code, Notepad — anything).</w:t>
+      </w:r>
+    </w:p>
+    <w:p>
+      <w:pPr/>
+      <w:r>
+        <w:rPr>
+          <w:rFonts w:ascii="Times" w:hAnsi="Times" w:cs="Times"/>
+          <w:sz w:val="20"/>
+          <w:sz-cs w:val="20"/>
+          <w:color w:val="111111"/>
+        </w:rPr>
+        <w:t xml:space="preserve"/>
+      </w:r>
+    </w:p>
+    <w:p>
+      <w:pPr/>
+      <w:r>
+        <w:rPr>
+          <w:rFonts w:ascii="Times" w:hAnsi="Times" w:cs="Times"/>
+          <w:sz w:val="24"/>
+          <w:sz-cs w:val="24"/>
+        </w:rPr>
+        <w:t>Find the section that begins with “tokens:” and fill in the line(s) for the platform you are using. Keep the two spaces before each name exactly as shown — YAML is fussy about spacing:</w:t>
+      </w:r>
+    </w:p>
+    <w:p>
+      <w:pPr/>
+      <w:r>
+        <w:rPr>
+          <w:rFonts w:ascii="Times" w:hAnsi="Times" w:cs="Times"/>
+          <w:sz w:val="20"/>
+          <w:sz-cs w:val="20"/>
+          <w:color w:val="111111"/>
+        </w:rPr>
+        <w:t>tokens:</w:t>
         <w:br/>
-        <w:t xml:space="preserve">gitlab_token=glpat_your_gitlab_token</w:t>
+        <w:t xml:space="preserve">  github-data-token: ghp_your_github_token</w:t>
         <w:br/>
-        <w:t xml:space="preserve">openai_key=sk-your_openai_key</w:t>
+        <w:t xml:space="preserve">  gitlab_token: glpat_your_gitlab_token</w:t>
         <w:br/>
-        <w:t xml:space="preserve">bitbucket_token=your_bitbucket_token</w:t>
+        <w:t xml:space="preserve">  openai_key: sk-your_openai_key</w:t>
         <w:br/>
-        <w:t xml:space="preserve">bitbucket_username=your_bitbucket_username</w:t>
+        <w:t xml:space="preserve">  bitbucket_token: your_bitbucket_token</w:t>
+        <w:br/>
+        <w:t xml:space="preserve">  bitbucket_username: your_atlassian_email_or_bitbucket_username</w:t>
       </w:r>
     </w:p>
     <w:p>
@@ -814,71 +780,63 @@
           <w:sz w:val="24"/>
           <w:sz-cs w:val="24"/>
         </w:rPr>
-        <w:t xml:space="preserve">Only needed if analyzing a GitHub org or repo. GitHub.com </w:t>
-      </w:r>
-      <w:r>
-        <w:rPr>
-          <w:rFonts w:ascii="Times New Roman" w:hAnsi="Times New Roman" w:cs="Times New Roman"/>
-          <w:sz w:val="24"/>
-          <w:sz-cs w:val="24"/>
-        </w:rPr>
-        <w:t xml:space="preserve">→</w:t>
-      </w:r>
-      <w:r>
-        <w:rPr>
-          <w:rFonts w:ascii="Times" w:hAnsi="Times" w:cs="Times"/>
-          <w:sz w:val="24"/>
-          <w:sz-cs w:val="24"/>
-        </w:rPr>
-        <w:t xml:space="preserve"> Settings </w:t>
-      </w:r>
-      <w:r>
-        <w:rPr>
-          <w:rFonts w:ascii="Times New Roman" w:hAnsi="Times New Roman" w:cs="Times New Roman"/>
-          <w:sz w:val="24"/>
-          <w:sz-cs w:val="24"/>
-        </w:rPr>
-        <w:t xml:space="preserve">→</w:t>
-      </w:r>
-      <w:r>
-        <w:rPr>
-          <w:rFonts w:ascii="Times" w:hAnsi="Times" w:cs="Times"/>
-          <w:sz w:val="24"/>
-          <w:sz-cs w:val="24"/>
-        </w:rPr>
-        <w:t xml:space="preserve"> Developer settings </w:t>
-      </w:r>
-      <w:r>
-        <w:rPr>
-          <w:rFonts w:ascii="Times New Roman" w:hAnsi="Times New Roman" w:cs="Times New Roman"/>
-          <w:sz w:val="24"/>
-          <w:sz-cs w:val="24"/>
-        </w:rPr>
-        <w:t xml:space="preserve">→</w:t>
-      </w:r>
-      <w:r>
-        <w:rPr>
-          <w:rFonts w:ascii="Times" w:hAnsi="Times" w:cs="Times"/>
-          <w:sz w:val="24"/>
-          <w:sz-cs w:val="24"/>
-        </w:rPr>
-        <w:t xml:space="preserve"> Personal access tokens </w:t>
-      </w:r>
-      <w:r>
-        <w:rPr>
-          <w:rFonts w:ascii="Times New Roman" w:hAnsi="Times New Roman" w:cs="Times New Roman"/>
-          <w:sz w:val="24"/>
-          <w:sz-cs w:val="24"/>
-        </w:rPr>
-        <w:t xml:space="preserve">→</w:t>
-      </w:r>
-      <w:r>
-        <w:rPr>
-          <w:rFonts w:ascii="Times" w:hAnsi="Times" w:cs="Times"/>
-          <w:sz w:val="24"/>
-          <w:sz-cs w:val="24"/>
-        </w:rPr>
-        <w:t xml:space="preserve"> generate one with repo read access.</w:t>
+        <w:t>Only needed if analyzing a GitHub org or repo. GitHub.com → Settings → Developer settings → Personal access tokens → Tokens (classic) → Generate new token. Tick the full “repo” scope (the top checkbox) — this is required to see PRIVATE repositories; “public_repo” alone will silently skip them. If the organisation uses single sign-on (SSO), also click “Configure SSO → Authorize” on the token, or its private repos stay hidden.</w:t>
+      </w:r>
+      <w:r>
+        <w:rPr>
+          <w:rFonts w:ascii="Times" w:hAnsi="Times" w:cs="Times New Roman"/>
+          <w:sz w:val="24"/>
+          <w:sz-cs w:val="24"/>
+        </w:rPr>
+      </w:r>
+      <w:r>
+        <w:rPr>
+          <w:rFonts w:ascii="Times" w:hAnsi="Times" w:cs="Times"/>
+          <w:sz w:val="24"/>
+          <w:sz-cs w:val="24"/>
+        </w:rPr>
+      </w:r>
+      <w:r>
+        <w:rPr>
+          <w:rFonts w:ascii="Times" w:hAnsi="Times" w:cs="Times New Roman"/>
+          <w:sz w:val="24"/>
+          <w:sz-cs w:val="24"/>
+        </w:rPr>
+      </w:r>
+      <w:r>
+        <w:rPr>
+          <w:rFonts w:ascii="Times" w:hAnsi="Times" w:cs="Times"/>
+          <w:sz w:val="24"/>
+          <w:sz-cs w:val="24"/>
+        </w:rPr>
+      </w:r>
+      <w:r>
+        <w:rPr>
+          <w:rFonts w:ascii="Times" w:hAnsi="Times" w:cs="Times New Roman"/>
+          <w:sz w:val="24"/>
+          <w:sz-cs w:val="24"/>
+        </w:rPr>
+      </w:r>
+      <w:r>
+        <w:rPr>
+          <w:rFonts w:ascii="Times" w:hAnsi="Times" w:cs="Times"/>
+          <w:sz w:val="24"/>
+          <w:sz-cs w:val="24"/>
+        </w:rPr>
+      </w:r>
+      <w:r>
+        <w:rPr>
+          <w:rFonts w:ascii="Times" w:hAnsi="Times" w:cs="Times New Roman"/>
+          <w:sz w:val="24"/>
+          <w:sz-cs w:val="24"/>
+        </w:rPr>
+      </w:r>
+      <w:r>
+        <w:rPr>
+          <w:rFonts w:ascii="Times" w:hAnsi="Times" w:cs="Times"/>
+          <w:sz w:val="24"/>
+          <w:sz-cs w:val="24"/>
+        </w:rPr>
       </w:r>
     </w:p>
     <w:p>
@@ -1016,7 +974,7 @@
           <w:b/>
           <w:color w:val="2A5C8A"/>
         </w:rPr>
-        <w:t xml:space="preserve">NOTE: </w:t>
+        <w:t>NOTE: config.yml is deliberately excluded from git, so your secret keys are never accidentally uploaded anywhere.</w:t>
       </w:r>
       <w:r>
         <w:rPr>
@@ -1026,7 +984,6 @@
           <w:i/>
           <w:color w:val="555555"/>
         </w:rPr>
-        <w:t xml:space="preserve">The “tokens” file (without .example) is deliberately excluded from git, so your secret keys are never accidentally uploaded anywhere.</w:t>
       </w:r>
     </w:p>
     <w:p>
@@ -1072,7 +1029,7 @@
           <w:sz-cs w:val="20"/>
           <w:color w:val="111111"/>
         </w:rPr>
-        <w:t xml:space="preserve">python run_org_pipeline.py --github-org &lt;ORG_NAME&gt; --tokens-file tokens --workers 10</w:t>
+        <w:t>org-analyser --github-org &lt;ORG_NAME&gt; --workers 10</w:t>
       </w:r>
     </w:p>
     <w:p>
@@ -1107,7 +1064,7 @@
           <w:sz-cs w:val="20"/>
           <w:color w:val="111111"/>
         </w:rPr>
-        <w:t xml:space="preserve">python run_org_pipeline.py --github-repo &lt;OWNER&gt;/&lt;REPO&gt; --tokens-file tokens --workers 1</w:t>
+        <w:t>org-analyser --github-repo &lt;OWNER&gt;/&lt;REPO&gt; --workers 1</w:t>
       </w:r>
     </w:p>
     <w:p>
@@ -1142,7 +1099,7 @@
           <w:sz-cs w:val="20"/>
           <w:color w:val="111111"/>
         </w:rPr>
-        <w:t xml:space="preserve">python run_org_pipeline.py --gitlab-group &lt;GROUP_NAME&gt; --tokens-file tokens --workers 10</w:t>
+        <w:t>org-analyser --gitlab-group &lt;GROUP_NAME&gt; --workers 10</w:t>
       </w:r>
     </w:p>
     <w:p>
@@ -1177,7 +1134,7 @@
           <w:sz-cs w:val="20"/>
           <w:color w:val="111111"/>
         </w:rPr>
-        <w:t xml:space="preserve">python run_org_pipeline.py --gitlab-project &lt;GROUP&gt;/&lt;PROJECT&gt; --tokens-file tokens --workers 1</w:t>
+        <w:t>org-analyser --gitlab-project &lt;GROUP&gt;/&lt;PROJECT&gt; --workers 1</w:t>
       </w:r>
     </w:p>
     <w:p>
@@ -1209,7 +1166,7 @@
           <w:rFonts w:ascii="Times" w:hAnsi="Times"/>
           <w:sz w:val="20"/>
         </w:rPr>
-        <w:t>python run_org_pipeline.py --bitbucket-repo &lt;WORKSPACE&gt;/&lt;REPO&gt; --tokens-file tokens --workers 1</w:t>
+        <w:t>org-analyser --bitbucket-repo &lt;WORKSPACE&gt;/&lt;REPO&gt; --workers 1</w:t>
       </w:r>
     </w:p>
     <w:p>
@@ -1229,7 +1186,7 @@
           <w:rFonts w:ascii="Times" w:hAnsi="Times"/>
           <w:sz w:val="20"/>
         </w:rPr>
-        <w:t>python run_org_pipeline.py --bitbucket-workspace &lt;WORKSPACE&gt; --tokens-file tokens --workers 10</w:t>
+        <w:t>org-analyser --bitbucket-workspace &lt;WORKSPACE&gt; --workers 10</w:t>
       </w:r>
     </w:p>
     <w:p>
@@ -1252,7 +1209,7 @@
           <w:sz-cs w:val="20"/>
           <w:color w:val="111111"/>
         </w:rPr>
-        <w:t xml:space="preserve">python run_org_pipeline.py --local-repos-dir ./repos --repos-manifest repos-manifest.example.json --tokens-file tokens --workers 4</w:t>
+        <w:t>org-analyser --local-repos-dir ./repos --workers 4</w:t>
       </w:r>
     </w:p>
     <w:p>
@@ -1279,7 +1236,7 @@
           <w:b/>
           <w:color w:val="2A5C8A"/>
         </w:rPr>
-        <w:t xml:space="preserve">NOTE: </w:t>
+        <w:t>NOTE: Replace &lt;ORG_NAME&gt;, &lt;OWNER&gt;/&lt;REPO&gt;, &lt;GROUP_NAME&gt;, and &lt;GROUP&gt;/&lt;PROJECT&gt; with the real names — remove the angle brackets too. For example: --github-org acme-inc. If your terminal says “org-analyser: command not found”, make sure .venv is active (Step 3), or use “python cli.py” with the same flags instead.</w:t>
       </w:r>
       <w:r>
         <w:rPr>
@@ -1289,7 +1246,6 @@
           <w:i/>
           <w:color w:val="555555"/>
         </w:rPr>
-        <w:t xml:space="preserve">Replace &lt;ORG_NAME&gt;, &lt;OWNER&gt;/&lt;REPO&gt;, &lt;GROUP_NAME&gt;, and &lt;GROUP&gt;/&lt;PROJECT&gt; with the real names — remove the angle brackets too. For example: --github-org acme-inc</w:t>
       </w:r>
     </w:p>
     <w:p>
@@ -1304,7 +1260,7 @@
           <w:b/>
           <w:color w:val="2A5C8A"/>
         </w:rPr>
-        <w:t xml:space="preserve">TIP: </w:t>
+        <w:t>TIP: To skip the deepest (and slowest) quality-scoring step for a faster run, add --skip-quality-score to the end of any command above.</w:t>
       </w:r>
       <w:r>
         <w:rPr>
@@ -1314,7 +1270,6 @@
           <w:i/>
           <w:color w:val="555555"/>
         </w:rPr>
-        <w:t xml:space="preserve">There is a lighter version that skips the deepest quality-scoring step. Use run_org_pipeline_no_quality.py instead of run_org_pipeline.py with the exact same flags if you want a faster, simpler run.</w:t>
       </w:r>
     </w:p>
     <w:p>
@@ -1354,7 +1309,7 @@
           <w:rFonts w:ascii="Times" w:hAnsi="Times"/>
           <w:sz w:val="20"/>
         </w:rPr>
-        <w:t>python run_org_pipeline.py --local-repos-dir "/path/to/your-project" --tokens-file tokens --local-only</w:t>
+        <w:t>org-analyser --local-repos-dir "/path/to/your-project" --local-only</w:t>
       </w:r>
     </w:p>
     <w:p>
@@ -1374,7 +1329,7 @@
           <w:rFonts w:ascii="Times" w:hAnsi="Times"/>
           <w:sz w:val="20"/>
         </w:rPr>
-        <w:t>python run_org_pipeline.py --local-repos-dir "/path/to/folder-of-projects" --tokens-file tokens --local-only</w:t>
+        <w:t>org-analyser --local-repos-dir "/path/to/folder-of-projects" --local-only</w:t>
       </w:r>
     </w:p>
     <w:p>
@@ -1694,6 +1649,96 @@
           <w:sz w:val="24"/>
         </w:rPr>
         <w:t>Add “--workers 1” to the end of your command and run it again. Older copies of the tool could corrupt the shared results file when several repos were processed at once; running one at a time avoids it. (The latest code already fixes this.)</w:t>
+      </w:r>
+    </w:p>
+    <w:p>
+      <w:r>
+        <w:rPr>
+          <w:rFonts w:ascii="Times" w:hAnsi="Times"/>
+          <w:sz w:val="24"/>
+        </w:rPr>
+        <w:t>On a Mac: “CERTIFICATE_VERIFY_FAILED” or “unable to get local issuer certificate”</w:t>
+      </w:r>
+    </w:p>
+    <w:p>
+      <w:r>
+        <w:rPr>
+          <w:rFonts w:ascii="Times" w:hAnsi="Times"/>
+          <w:sz w:val="24"/>
+        </w:rPr>
+        <w:t>Your Python (downloaded from python.org) has no security certificates set up yet. In Finder, open Applications → Python 3.x and double-click “Install Certificates.command”, then run the pipeline again. (Terminal alternative: run “pip install certifi”, then export SSL_CERT_FILE="$(python -m certifi)" in the same window.)</w:t>
+      </w:r>
+    </w:p>
+    <w:p>
+      <w:r>
+        <w:rPr>
+          <w:rFonts w:ascii="Times" w:hAnsi="Times"/>
+          <w:sz w:val="24"/>
+        </w:rPr>
+        <w:t>Private GitHub repositories are missing from the results</w:t>
+      </w:r>
+    </w:p>
+    <w:p>
+      <w:r>
+        <w:rPr>
+          <w:rFonts w:ascii="Times" w:hAnsi="Times"/>
+          <w:sz w:val="24"/>
+        </w:rPr>
+        <w:t>The token can only see what it has permission for. Use a CLASSIC token with the full “repo” scope ticked (not just public_repo), put it in github-data-token, and — if the organisation uses SSO — click “Configure SSO → Authorize” on the token page. Fine-grained tokens usually cannot see org repos unless the organisation has approved them.</w:t>
+      </w:r>
+    </w:p>
+    <w:p>
+      <w:r>
+        <w:rPr>
+          <w:rFonts w:ascii="Times" w:hAnsi="Times"/>
+          <w:sz w:val="24"/>
+        </w:rPr>
+        <w:t>Error: “repos manifest includes GitLab repos but gitlab_token is missing”</w:t>
+      </w:r>
+    </w:p>
+    <w:p>
+      <w:r>
+        <w:rPr>
+          <w:rFonts w:ascii="Times" w:hAnsi="Times"/>
+          <w:sz w:val="24"/>
+        </w:rPr>
+        <w:t>You passed --repos-manifest repos-manifest.example.json — that is only a SAMPLE file that lists a GitLab repo. For a plain scan of code on your computer, remove that option and add --local-only instead.</w:t>
+      </w:r>
+    </w:p>
+    <w:p>
+      <w:r>
+        <w:rPr>
+          <w:rFonts w:ascii="Times" w:hAnsi="Times"/>
+          <w:sz w:val="24"/>
+        </w:rPr>
+        <w:t>Windows: “scc is not on PATH”</w:t>
+      </w:r>
+    </w:p>
+    <w:p>
+      <w:r>
+        <w:rPr>
+          <w:rFonts w:ascii="Times" w:hAnsi="Times"/>
+          <w:sz w:val="24"/>
+        </w:rPr>
+        <w:t>The scc tool from Step 1 was never installed on this machine. Download the Windows zip from the scc releases page on GitHub, unzip it to get scc.exe, and copy scc.exe into your project’s .venv\Scripts\ folder (already on PATH when .venv is active). Run “scc --version” to confirm, then rerun.</w:t>
+      </w:r>
+    </w:p>
+    <w:p>
+      <w:r>
+        <w:rPr>
+          <w:rFonts w:ascii="Times" w:hAnsi="Times"/>
+          <w:sz w:val="24"/>
+        </w:rPr>
+        <w:t>repo-quality-score is missing for some repositories</w:t>
+      </w:r>
+    </w:p>
+    <w:p>
+      <w:r>
+        <w:rPr>
+          <w:rFonts w:ascii="Times" w:hAnsi="Times"/>
+          <w:sz w:val="24"/>
+        </w:rPr>
+        <w:t>That repository’s quality step failed — most often because it is empty / has no commits, or is very large and timed out — so no score was saved for it. The run still finishes for the others. Open manifest.json in the output folder and read that repo’s repo-quality-score entry for the exact reason.</w:t>
       </w:r>
     </w:p>
     <w:p>

</xml_diff>